<commit_message>
feat(SIMS): Phase 5 Exam Halls, Visitor Management, PTM, Feedback, Consent Forms
Ships the remainder of Phase 5: exam hall setup/auto-allocation/invigilators/
admit cards, visitor sign-in/badges/blocked-list/daily summary, PTM slot
booking, parent feedback & complaints, and digital consent forms with
signatures and automated reminders. Also fixes two RBAC gaps found live
(security officer couldn't search staff for the visitor Host field; result
publishing moved from admin/principal to principal/section_head per request).

Co-Authored-By: Claude Sonnet 5 <noreply@anthropic.com>
</commit_message>
<xml_diff>
--- a/docs/SIMS_Phase5_Sprint_Plan_v1.0.docx
+++ b/docs/SIMS_Phase5_Sprint_Plan_v1.0.docx
@@ -859,12 +859,6 @@
         <w:gridCol w:w="5060"/>
       </w:tblGrid>
       <w:tr>
-        <w:tblPrEx>
-          <w:tblCellMar>
-            <w:top w:w="0" w:type="dxa"/>
-            <w:bottom w:w="0" w:type="dxa"/>
-          </w:tblCellMar>
-        </w:tblPrEx>
         <w:trPr>
           <w:tblHeader/>
         </w:trPr>
@@ -960,12 +954,6 @@
         </w:tc>
       </w:tr>
       <w:tr>
-        <w:tblPrEx>
-          <w:tblCellMar>
-            <w:top w:w="0" w:type="dxa"/>
-            <w:bottom w:w="0" w:type="dxa"/>
-          </w:tblCellMar>
-        </w:tblPrEx>
         <w:tc>
           <w:tcPr>
             <w:tcW w:w="1500" w:type="dxa"/>
@@ -1058,12 +1046,6 @@
         </w:tc>
       </w:tr>
       <w:tr>
-        <w:tblPrEx>
-          <w:tblCellMar>
-            <w:top w:w="0" w:type="dxa"/>
-            <w:bottom w:w="0" w:type="dxa"/>
-          </w:tblCellMar>
-        </w:tblPrEx>
         <w:tc>
           <w:tcPr>
             <w:tcW w:w="1500" w:type="dxa"/>
@@ -1156,12 +1138,6 @@
         </w:tc>
       </w:tr>
       <w:tr>
-        <w:tblPrEx>
-          <w:tblCellMar>
-            <w:top w:w="0" w:type="dxa"/>
-            <w:bottom w:w="0" w:type="dxa"/>
-          </w:tblCellMar>
-        </w:tblPrEx>
         <w:tc>
           <w:tcPr>
             <w:tcW w:w="1500" w:type="dxa"/>
@@ -1254,12 +1230,6 @@
         </w:tc>
       </w:tr>
       <w:tr>
-        <w:tblPrEx>
-          <w:tblCellMar>
-            <w:top w:w="0" w:type="dxa"/>
-            <w:bottom w:w="0" w:type="dxa"/>
-          </w:tblCellMar>
-        </w:tblPrEx>
         <w:tc>
           <w:tcPr>
             <w:tcW w:w="1500" w:type="dxa"/>
@@ -1407,12 +1377,6 @@
         <w:gridCol w:w="2860"/>
       </w:tblGrid>
       <w:tr>
-        <w:tblPrEx>
-          <w:tblCellMar>
-            <w:top w:w="0" w:type="dxa"/>
-            <w:bottom w:w="0" w:type="dxa"/>
-          </w:tblCellMar>
-        </w:tblPrEx>
         <w:trPr>
           <w:tblHeader/>
         </w:trPr>
@@ -1568,12 +1532,6 @@
         </w:tc>
       </w:tr>
       <w:tr>
-        <w:tblPrEx>
-          <w:tblCellMar>
-            <w:top w:w="0" w:type="dxa"/>
-            <w:bottom w:w="0" w:type="dxa"/>
-          </w:tblCellMar>
-        </w:tblPrEx>
         <w:tc>
           <w:tcPr>
             <w:tcW w:w="3000" w:type="dxa"/>
@@ -1726,12 +1684,6 @@
         </w:tc>
       </w:tr>
       <w:tr>
-        <w:tblPrEx>
-          <w:tblCellMar>
-            <w:top w:w="0" w:type="dxa"/>
-            <w:bottom w:w="0" w:type="dxa"/>
-          </w:tblCellMar>
-        </w:tblPrEx>
         <w:tc>
           <w:tcPr>
             <w:tcW w:w="3000" w:type="dxa"/>
@@ -1884,12 +1836,6 @@
         </w:tc>
       </w:tr>
       <w:tr>
-        <w:tblPrEx>
-          <w:tblCellMar>
-            <w:top w:w="0" w:type="dxa"/>
-            <w:bottom w:w="0" w:type="dxa"/>
-          </w:tblCellMar>
-        </w:tblPrEx>
         <w:tc>
           <w:tcPr>
             <w:tcW w:w="3000" w:type="dxa"/>
@@ -2042,12 +1988,6 @@
         </w:tc>
       </w:tr>
       <w:tr>
-        <w:tblPrEx>
-          <w:tblCellMar>
-            <w:top w:w="0" w:type="dxa"/>
-            <w:bottom w:w="0" w:type="dxa"/>
-          </w:tblCellMar>
-        </w:tblPrEx>
         <w:tc>
           <w:tcPr>
             <w:tcW w:w="3000" w:type="dxa"/>
@@ -2200,12 +2140,6 @@
         </w:tc>
       </w:tr>
       <w:tr>
-        <w:tblPrEx>
-          <w:tblCellMar>
-            <w:top w:w="0" w:type="dxa"/>
-            <w:bottom w:w="0" w:type="dxa"/>
-          </w:tblCellMar>
-        </w:tblPrEx>
         <w:tc>
           <w:tcPr>
             <w:tcW w:w="3000" w:type="dxa"/>
@@ -2358,12 +2292,6 @@
         </w:tc>
       </w:tr>
       <w:tr>
-        <w:tblPrEx>
-          <w:tblCellMar>
-            <w:top w:w="0" w:type="dxa"/>
-            <w:bottom w:w="0" w:type="dxa"/>
-          </w:tblCellMar>
-        </w:tblPrEx>
         <w:tc>
           <w:tcPr>
             <w:tcW w:w="3000" w:type="dxa"/>
@@ -2516,12 +2444,6 @@
         </w:tc>
       </w:tr>
       <w:tr>
-        <w:tblPrEx>
-          <w:tblCellMar>
-            <w:top w:w="0" w:type="dxa"/>
-            <w:bottom w:w="0" w:type="dxa"/>
-          </w:tblCellMar>
-        </w:tblPrEx>
         <w:tc>
           <w:tcPr>
             <w:tcW w:w="3000" w:type="dxa"/>
@@ -2736,12 +2658,6 @@
         <w:gridCol w:w="9360"/>
       </w:tblGrid>
       <w:tr>
-        <w:tblPrEx>
-          <w:tblCellMar>
-            <w:top w:w="0" w:type="dxa"/>
-            <w:bottom w:w="0" w:type="dxa"/>
-          </w:tblCellMar>
-        </w:tblPrEx>
         <w:tc>
           <w:tcPr>
             <w:tcW w:w="9360" w:type="dxa"/>
@@ -2802,12 +2718,6 @@
         </w:tc>
       </w:tr>
       <w:tr>
-        <w:tblPrEx>
-          <w:tblCellMar>
-            <w:top w:w="0" w:type="dxa"/>
-            <w:bottom w:w="0" w:type="dxa"/>
-          </w:tblCellMar>
-        </w:tblPrEx>
         <w:tc>
           <w:tcPr>
             <w:tcW w:w="9360" w:type="dxa"/>
@@ -2870,12 +2780,6 @@
         </w:tc>
       </w:tr>
       <w:tr>
-        <w:tblPrEx>
-          <w:tblCellMar>
-            <w:top w:w="0" w:type="dxa"/>
-            <w:bottom w:w="0" w:type="dxa"/>
-          </w:tblCellMar>
-        </w:tblPrEx>
         <w:tc>
           <w:tcPr>
             <w:tcW w:w="9360" w:type="dxa"/>
@@ -3012,12 +2916,6 @@
         </w:tc>
       </w:tr>
       <w:tr>
-        <w:tblPrEx>
-          <w:tblCellMar>
-            <w:top w:w="0" w:type="dxa"/>
-            <w:bottom w:w="0" w:type="dxa"/>
-          </w:tblCellMar>
-        </w:tblPrEx>
         <w:tc>
           <w:tcPr>
             <w:tcW w:w="9360" w:type="dxa"/>
@@ -3484,12 +3382,6 @@
         <w:gridCol w:w="9360"/>
       </w:tblGrid>
       <w:tr>
-        <w:tblPrEx>
-          <w:tblCellMar>
-            <w:top w:w="0" w:type="dxa"/>
-            <w:bottom w:w="0" w:type="dxa"/>
-          </w:tblCellMar>
-        </w:tblPrEx>
         <w:tc>
           <w:tcPr>
             <w:tcW w:w="9360" w:type="dxa"/>
@@ -3550,12 +3442,6 @@
         </w:tc>
       </w:tr>
       <w:tr>
-        <w:tblPrEx>
-          <w:tblCellMar>
-            <w:top w:w="0" w:type="dxa"/>
-            <w:bottom w:w="0" w:type="dxa"/>
-          </w:tblCellMar>
-        </w:tblPrEx>
         <w:tc>
           <w:tcPr>
             <w:tcW w:w="9360" w:type="dxa"/>
@@ -3636,12 +3522,6 @@
         </w:tc>
       </w:tr>
       <w:tr>
-        <w:tblPrEx>
-          <w:tblCellMar>
-            <w:top w:w="0" w:type="dxa"/>
-            <w:bottom w:w="0" w:type="dxa"/>
-          </w:tblCellMar>
-        </w:tblPrEx>
         <w:tc>
           <w:tcPr>
             <w:tcW w:w="9360" w:type="dxa"/>
@@ -3760,12 +3640,6 @@
         </w:tc>
       </w:tr>
       <w:tr>
-        <w:tblPrEx>
-          <w:tblCellMar>
-            <w:top w:w="0" w:type="dxa"/>
-            <w:bottom w:w="0" w:type="dxa"/>
-          </w:tblCellMar>
-        </w:tblPrEx>
         <w:tc>
           <w:tcPr>
             <w:tcW w:w="9360" w:type="dxa"/>
@@ -4067,12 +3941,6 @@
         <w:gridCol w:w="9360"/>
       </w:tblGrid>
       <w:tr>
-        <w:tblPrEx>
-          <w:tblCellMar>
-            <w:top w:w="0" w:type="dxa"/>
-            <w:bottom w:w="0" w:type="dxa"/>
-          </w:tblCellMar>
-        </w:tblPrEx>
         <w:tc>
           <w:tcPr>
             <w:tcW w:w="9360" w:type="dxa"/>
@@ -4133,12 +4001,6 @@
         </w:tc>
       </w:tr>
       <w:tr>
-        <w:tblPrEx>
-          <w:tblCellMar>
-            <w:top w:w="0" w:type="dxa"/>
-            <w:bottom w:w="0" w:type="dxa"/>
-          </w:tblCellMar>
-        </w:tblPrEx>
         <w:tc>
           <w:tcPr>
             <w:tcW w:w="9360" w:type="dxa"/>
@@ -4219,12 +4081,6 @@
         </w:tc>
       </w:tr>
       <w:tr>
-        <w:tblPrEx>
-          <w:tblCellMar>
-            <w:top w:w="0" w:type="dxa"/>
-            <w:bottom w:w="0" w:type="dxa"/>
-          </w:tblCellMar>
-        </w:tblPrEx>
         <w:tc>
           <w:tcPr>
             <w:tcW w:w="9360" w:type="dxa"/>
@@ -4361,12 +4217,6 @@
         </w:tc>
       </w:tr>
       <w:tr>
-        <w:tblPrEx>
-          <w:tblCellMar>
-            <w:top w:w="0" w:type="dxa"/>
-            <w:bottom w:w="0" w:type="dxa"/>
-          </w:tblCellMar>
-        </w:tblPrEx>
         <w:tc>
           <w:tcPr>
             <w:tcW w:w="9360" w:type="dxa"/>
@@ -4948,6 +4798,24 @@
                 <w:szCs w:val="18"/>
               </w:rPr>
               <w:t>. Write tests for the auto-allocation filling order, the special-needs front-row placement, and the class-mixing interleave logic.</w:t>
+            </w:r>
+            <w:r>
+              <w:rPr>
+                <w:rFonts w:ascii="Courier New" w:eastAsia="Courier New" w:hAnsi="Courier New" w:cs="Courier New"/>
+                <w:color w:val="3A2A52"/>
+                <w:sz w:val="18"/>
+                <w:szCs w:val="18"/>
+              </w:rPr>
+              <w:br/>
+            </w:r>
+            <w:r>
+              <w:rPr>
+                <w:rFonts w:ascii="Courier New" w:eastAsia="Courier New" w:hAnsi="Courier New" w:cs="Courier New"/>
+                <w:color w:val="FF0000"/>
+                <w:sz w:val="18"/>
+                <w:szCs w:val="18"/>
+              </w:rPr>
+              <w:t>done</w:t>
             </w:r>
           </w:p>
         </w:tc>
@@ -4975,12 +4843,6 @@
         <w:gridCol w:w="9360"/>
       </w:tblGrid>
       <w:tr>
-        <w:tblPrEx>
-          <w:tblCellMar>
-            <w:top w:w="0" w:type="dxa"/>
-            <w:bottom w:w="0" w:type="dxa"/>
-          </w:tblCellMar>
-        </w:tblPrEx>
         <w:tc>
           <w:tcPr>
             <w:tcW w:w="9360" w:type="dxa"/>
@@ -5041,12 +4903,6 @@
         </w:tc>
       </w:tr>
       <w:tr>
-        <w:tblPrEx>
-          <w:tblCellMar>
-            <w:top w:w="0" w:type="dxa"/>
-            <w:bottom w:w="0" w:type="dxa"/>
-          </w:tblCellMar>
-        </w:tblPrEx>
         <w:tc>
           <w:tcPr>
             <w:tcW w:w="9360" w:type="dxa"/>
@@ -5127,12 +4983,6 @@
         </w:tc>
       </w:tr>
       <w:tr>
-        <w:tblPrEx>
-          <w:tblCellMar>
-            <w:top w:w="0" w:type="dxa"/>
-            <w:bottom w:w="0" w:type="dxa"/>
-          </w:tblCellMar>
-        </w:tblPrEx>
         <w:tc>
           <w:tcPr>
             <w:tcW w:w="9360" w:type="dxa"/>
@@ -5252,12 +5102,6 @@
         </w:tc>
       </w:tr>
       <w:tr>
-        <w:tblPrEx>
-          <w:tblCellMar>
-            <w:top w:w="0" w:type="dxa"/>
-            <w:bottom w:w="0" w:type="dxa"/>
-          </w:tblCellMar>
-        </w:tblPrEx>
         <w:tc>
           <w:tcPr>
             <w:tcW w:w="9360" w:type="dxa"/>
@@ -5398,7 +5242,17 @@
                 <w:sz w:val="18"/>
                 <w:szCs w:val="18"/>
               </w:rPr>
-              <w:t xml:space="preserve"> creation, notify the staff member via Notification Service with hall name, exam name, date, start time, and student count for that hall. Build a seating plan PDF generator: for a given </w:t>
+              <w:t xml:space="preserve"> creation, notify the staff member via Notification Service with hall name, exam name, date, start time, and student count for that hall. Build a seating plan PDF </w:t>
+            </w:r>
+            <w:r>
+              <w:rPr>
+                <w:rFonts w:ascii="Courier New" w:eastAsia="Courier New" w:hAnsi="Courier New" w:cs="Courier New"/>
+                <w:color w:val="3A2A52"/>
+                <w:sz w:val="18"/>
+                <w:szCs w:val="18"/>
+              </w:rPr>
+              <w:lastRenderedPageBreak/>
+              <w:t xml:space="preserve">generator: for a given </w:t>
             </w:r>
             <w:proofErr w:type="spellStart"/>
             <w:r>
@@ -5478,17 +5332,7 @@
                 <w:sz w:val="18"/>
                 <w:szCs w:val="18"/>
               </w:rPr>
-              <w:t xml:space="preserve">) </w:t>
-            </w:r>
-            <w:r>
-              <w:rPr>
-                <w:rFonts w:ascii="Courier New" w:eastAsia="Courier New" w:hAnsi="Courier New" w:cs="Courier New"/>
-                <w:color w:val="3A2A52"/>
-                <w:sz w:val="18"/>
-                <w:szCs w:val="18"/>
-              </w:rPr>
-              <w:lastRenderedPageBreak/>
-              <w:t xml:space="preserve">with each cell showing the </w:t>
+              <w:t xml:space="preserve">) with each cell showing the </w:t>
             </w:r>
             <w:proofErr w:type="spellStart"/>
             <w:r>
@@ -5569,6 +5413,24 @@
                 <w:szCs w:val="18"/>
               </w:rPr>
               <w:t xml:space="preserve"> count, and exam start/end time. Write a test for the seating plan grid layout correctness (correct student at correct seat coordinates).</w:t>
+            </w:r>
+            <w:r>
+              <w:rPr>
+                <w:rFonts w:ascii="Courier New" w:eastAsia="Courier New" w:hAnsi="Courier New" w:cs="Courier New"/>
+                <w:color w:val="3A2A52"/>
+                <w:sz w:val="18"/>
+                <w:szCs w:val="18"/>
+              </w:rPr>
+              <w:br/>
+            </w:r>
+            <w:r>
+              <w:rPr>
+                <w:rFonts w:ascii="Courier New" w:eastAsia="Courier New" w:hAnsi="Courier New" w:cs="Courier New"/>
+                <w:color w:val="FF0000"/>
+                <w:sz w:val="18"/>
+                <w:szCs w:val="18"/>
+              </w:rPr>
+              <w:t>done</w:t>
             </w:r>
           </w:p>
         </w:tc>
@@ -5621,12 +5483,6 @@
         <w:gridCol w:w="9360"/>
       </w:tblGrid>
       <w:tr>
-        <w:tblPrEx>
-          <w:tblCellMar>
-            <w:top w:w="0" w:type="dxa"/>
-            <w:bottom w:w="0" w:type="dxa"/>
-          </w:tblCellMar>
-        </w:tblPrEx>
         <w:tc>
           <w:tcPr>
             <w:tcW w:w="9360" w:type="dxa"/>
@@ -5687,12 +5543,6 @@
         </w:tc>
       </w:tr>
       <w:tr>
-        <w:tblPrEx>
-          <w:tblCellMar>
-            <w:top w:w="0" w:type="dxa"/>
-            <w:bottom w:w="0" w:type="dxa"/>
-          </w:tblCellMar>
-        </w:tblPrEx>
         <w:tc>
           <w:tcPr>
             <w:tcW w:w="9360" w:type="dxa"/>
@@ -5755,12 +5605,6 @@
         </w:tc>
       </w:tr>
       <w:tr>
-        <w:tblPrEx>
-          <w:tblCellMar>
-            <w:top w:w="0" w:type="dxa"/>
-            <w:bottom w:w="0" w:type="dxa"/>
-          </w:tblCellMar>
-        </w:tblPrEx>
         <w:tc>
           <w:tcPr>
             <w:tcW w:w="9360" w:type="dxa"/>
@@ -5914,12 +5758,6 @@
         </w:tc>
       </w:tr>
       <w:tr>
-        <w:tblPrEx>
-          <w:tblCellMar>
-            <w:top w:w="0" w:type="dxa"/>
-            <w:bottom w:w="0" w:type="dxa"/>
-          </w:tblCellMar>
-        </w:tblPrEx>
         <w:tc>
           <w:tcPr>
             <w:tcW w:w="9360" w:type="dxa"/>
@@ -6621,6 +6459,24 @@
                 <w:szCs w:val="18"/>
               </w:rPr>
               <w:t xml:space="preserve"> can be set once). Write tests for the blocked-visitor alert, the overstay detection job, and the badge QR expiry time.</w:t>
+            </w:r>
+            <w:r>
+              <w:rPr>
+                <w:rFonts w:ascii="Courier New" w:eastAsia="Courier New" w:hAnsi="Courier New" w:cs="Courier New"/>
+                <w:color w:val="3A2A52"/>
+                <w:sz w:val="18"/>
+                <w:szCs w:val="18"/>
+              </w:rPr>
+              <w:br/>
+            </w:r>
+            <w:r>
+              <w:rPr>
+                <w:rFonts w:ascii="Courier New" w:eastAsia="Courier New" w:hAnsi="Courier New" w:cs="Courier New"/>
+                <w:color w:val="FF0000"/>
+                <w:sz w:val="18"/>
+                <w:szCs w:val="18"/>
+              </w:rPr>
+              <w:t>done</w:t>
             </w:r>
           </w:p>
         </w:tc>
@@ -6648,12 +6504,6 @@
         <w:gridCol w:w="9360"/>
       </w:tblGrid>
       <w:tr>
-        <w:tblPrEx>
-          <w:tblCellMar>
-            <w:top w:w="0" w:type="dxa"/>
-            <w:bottom w:w="0" w:type="dxa"/>
-          </w:tblCellMar>
-        </w:tblPrEx>
         <w:tc>
           <w:tcPr>
             <w:tcW w:w="9360" w:type="dxa"/>
@@ -6714,12 +6564,6 @@
         </w:tc>
       </w:tr>
       <w:tr>
-        <w:tblPrEx>
-          <w:tblCellMar>
-            <w:top w:w="0" w:type="dxa"/>
-            <w:bottom w:w="0" w:type="dxa"/>
-          </w:tblCellMar>
-        </w:tblPrEx>
         <w:tc>
           <w:tcPr>
             <w:tcW w:w="9360" w:type="dxa"/>
@@ -6782,12 +6626,6 @@
         </w:tc>
       </w:tr>
       <w:tr>
-        <w:tblPrEx>
-          <w:tblCellMar>
-            <w:top w:w="0" w:type="dxa"/>
-            <w:bottom w:w="0" w:type="dxa"/>
-          </w:tblCellMar>
-        </w:tblPrEx>
         <w:tc>
           <w:tcPr>
             <w:tcW w:w="9360" w:type="dxa"/>
@@ -6906,12 +6744,6 @@
         </w:tc>
       </w:tr>
       <w:tr>
-        <w:tblPrEx>
-          <w:tblCellMar>
-            <w:top w:w="0" w:type="dxa"/>
-            <w:bottom w:w="0" w:type="dxa"/>
-          </w:tblCellMar>
-        </w:tblPrEx>
         <w:tc>
           <w:tcPr>
             <w:tcW w:w="9360" w:type="dxa"/>
@@ -7072,7 +6904,17 @@
                 <w:sz w:val="18"/>
                 <w:szCs w:val="18"/>
               </w:rPr>
-              <w:t xml:space="preserve"> records for the day into a </w:t>
+              <w:t xml:space="preserve"> records for the day </w:t>
+            </w:r>
+            <w:r>
+              <w:rPr>
+                <w:rFonts w:ascii="Courier New" w:eastAsia="Courier New" w:hAnsi="Courier New" w:cs="Courier New"/>
+                <w:color w:val="3A2A52"/>
+                <w:sz w:val="18"/>
+                <w:szCs w:val="18"/>
+              </w:rPr>
+              <w:lastRenderedPageBreak/>
+              <w:t xml:space="preserve">into a </w:t>
             </w:r>
             <w:proofErr w:type="spellStart"/>
             <w:r>
@@ -7162,7 +7004,6 @@
                 <w:sz w:val="18"/>
                 <w:szCs w:val="18"/>
               </w:rPr>
-              <w:lastRenderedPageBreak/>
               <w:t>overstayCount</w:t>
             </w:r>
             <w:proofErr w:type="spellEnd"/>
@@ -7234,6 +7075,24 @@
                 <w:szCs w:val="18"/>
               </w:rPr>
               <w:t>=true. Write a test for the search query filters and the blocked-visitor sign-in rejection flow.</w:t>
+            </w:r>
+            <w:r>
+              <w:rPr>
+                <w:rFonts w:ascii="Courier New" w:eastAsia="Courier New" w:hAnsi="Courier New" w:cs="Courier New"/>
+                <w:color w:val="3A2A52"/>
+                <w:sz w:val="18"/>
+                <w:szCs w:val="18"/>
+              </w:rPr>
+              <w:br/>
+            </w:r>
+            <w:r>
+              <w:rPr>
+                <w:rFonts w:ascii="Courier New" w:eastAsia="Courier New" w:hAnsi="Courier New" w:cs="Courier New"/>
+                <w:color w:val="FF0000"/>
+                <w:sz w:val="18"/>
+                <w:szCs w:val="18"/>
+              </w:rPr>
+              <w:t>done</w:t>
             </w:r>
           </w:p>
         </w:tc>
@@ -7286,12 +7145,6 @@
         <w:gridCol w:w="9360"/>
       </w:tblGrid>
       <w:tr>
-        <w:tblPrEx>
-          <w:tblCellMar>
-            <w:top w:w="0" w:type="dxa"/>
-            <w:bottom w:w="0" w:type="dxa"/>
-          </w:tblCellMar>
-        </w:tblPrEx>
         <w:tc>
           <w:tcPr>
             <w:tcW w:w="9360" w:type="dxa"/>
@@ -7352,12 +7205,6 @@
         </w:tc>
       </w:tr>
       <w:tr>
-        <w:tblPrEx>
-          <w:tblCellMar>
-            <w:top w:w="0" w:type="dxa"/>
-            <w:bottom w:w="0" w:type="dxa"/>
-          </w:tblCellMar>
-        </w:tblPrEx>
         <w:tc>
           <w:tcPr>
             <w:tcW w:w="9360" w:type="dxa"/>
@@ -7420,12 +7267,6 @@
         </w:tc>
       </w:tr>
       <w:tr>
-        <w:tblPrEx>
-          <w:tblCellMar>
-            <w:top w:w="0" w:type="dxa"/>
-            <w:bottom w:w="0" w:type="dxa"/>
-          </w:tblCellMar>
-        </w:tblPrEx>
         <w:tc>
           <w:tcPr>
             <w:tcW w:w="9360" w:type="dxa"/>
@@ -7579,12 +7420,6 @@
         </w:tc>
       </w:tr>
       <w:tr>
-        <w:tblPrEx>
-          <w:tblCellMar>
-            <w:top w:w="0" w:type="dxa"/>
-            <w:bottom w:w="0" w:type="dxa"/>
-          </w:tblCellMar>
-        </w:tblPrEx>
         <w:tc>
           <w:tcPr>
             <w:tcW w:w="9360" w:type="dxa"/>
@@ -8186,6 +8021,24 @@
                 <w:szCs w:val="18"/>
               </w:rPr>
               <w:t xml:space="preserve"> guardian name and student name for the day. Write tests for slot availability enforcement (a booked slot cannot be double-booked), cancellation slot re-opening, and the 24-hour reminder job.</w:t>
+            </w:r>
+            <w:r>
+              <w:rPr>
+                <w:rFonts w:ascii="Courier New" w:eastAsia="Courier New" w:hAnsi="Courier New" w:cs="Courier New"/>
+                <w:color w:val="3A2A52"/>
+                <w:sz w:val="18"/>
+                <w:szCs w:val="18"/>
+              </w:rPr>
+              <w:br/>
+            </w:r>
+            <w:r>
+              <w:rPr>
+                <w:rFonts w:ascii="Courier New" w:eastAsia="Courier New" w:hAnsi="Courier New" w:cs="Courier New"/>
+                <w:color w:val="FF0000"/>
+                <w:sz w:val="18"/>
+                <w:szCs w:val="18"/>
+              </w:rPr>
+              <w:t>done</w:t>
             </w:r>
           </w:p>
         </w:tc>
@@ -8213,12 +8066,6 @@
         <w:gridCol w:w="9360"/>
       </w:tblGrid>
       <w:tr>
-        <w:tblPrEx>
-          <w:tblCellMar>
-            <w:top w:w="0" w:type="dxa"/>
-            <w:bottom w:w="0" w:type="dxa"/>
-          </w:tblCellMar>
-        </w:tblPrEx>
         <w:tc>
           <w:tcPr>
             <w:tcW w:w="9360" w:type="dxa"/>
@@ -8279,12 +8126,6 @@
         </w:tc>
       </w:tr>
       <w:tr>
-        <w:tblPrEx>
-          <w:tblCellMar>
-            <w:top w:w="0" w:type="dxa"/>
-            <w:bottom w:w="0" w:type="dxa"/>
-          </w:tblCellMar>
-        </w:tblPrEx>
         <w:tc>
           <w:tcPr>
             <w:tcW w:w="9360" w:type="dxa"/>
@@ -8347,12 +8188,6 @@
         </w:tc>
       </w:tr>
       <w:tr>
-        <w:tblPrEx>
-          <w:tblCellMar>
-            <w:top w:w="0" w:type="dxa"/>
-            <w:bottom w:w="0" w:type="dxa"/>
-          </w:tblCellMar>
-        </w:tblPrEx>
         <w:tc>
           <w:tcPr>
             <w:tcW w:w="9360" w:type="dxa"/>
@@ -8489,12 +8324,6 @@
         </w:tc>
       </w:tr>
       <w:tr>
-        <w:tblPrEx>
-          <w:tblCellMar>
-            <w:top w:w="0" w:type="dxa"/>
-            <w:bottom w:w="0" w:type="dxa"/>
-          </w:tblCellMar>
-        </w:tblPrEx>
         <w:tc>
           <w:tcPr>
             <w:tcW w:w="9360" w:type="dxa"/>
@@ -8997,6 +8826,21 @@
                 <w:szCs w:val="18"/>
               </w:rPr>
               <w:t xml:space="preserve"> notification on creation, and the guardian notification on resolution.</w:t>
+            </w:r>
+            <w:r>
+              <w:rPr>
+                <w:rFonts w:ascii="Courier New" w:eastAsia="Courier New" w:hAnsi="Courier New" w:cs="Courier New"/>
+                <w:color w:val="3A2A52"/>
+                <w:sz w:val="18"/>
+                <w:szCs w:val="18"/>
+              </w:rPr>
+              <w:br/>
+            </w:r>
+            <w:r>
+              <w:rPr>
+                <w:color w:val="FF0000"/>
+              </w:rPr>
+              <w:t>done</w:t>
             </w:r>
           </w:p>
         </w:tc>
@@ -9024,12 +8868,6 @@
         <w:gridCol w:w="9360"/>
       </w:tblGrid>
       <w:tr>
-        <w:tblPrEx>
-          <w:tblCellMar>
-            <w:top w:w="0" w:type="dxa"/>
-            <w:bottom w:w="0" w:type="dxa"/>
-          </w:tblCellMar>
-        </w:tblPrEx>
         <w:tc>
           <w:tcPr>
             <w:tcW w:w="9360" w:type="dxa"/>
@@ -9090,12 +8928,6 @@
         </w:tc>
       </w:tr>
       <w:tr>
-        <w:tblPrEx>
-          <w:tblCellMar>
-            <w:top w:w="0" w:type="dxa"/>
-            <w:bottom w:w="0" w:type="dxa"/>
-          </w:tblCellMar>
-        </w:tblPrEx>
         <w:tc>
           <w:tcPr>
             <w:tcW w:w="9360" w:type="dxa"/>
@@ -9174,12 +9006,6 @@
         </w:tc>
       </w:tr>
       <w:tr>
-        <w:tblPrEx>
-          <w:tblCellMar>
-            <w:top w:w="0" w:type="dxa"/>
-            <w:bottom w:w="0" w:type="dxa"/>
-          </w:tblCellMar>
-        </w:tblPrEx>
         <w:tc>
           <w:tcPr>
             <w:tcW w:w="9360" w:type="dxa"/>
@@ -9333,12 +9159,6 @@
         </w:tc>
       </w:tr>
       <w:tr>
-        <w:tblPrEx>
-          <w:tblCellMar>
-            <w:top w:w="0" w:type="dxa"/>
-            <w:bottom w:w="0" w:type="dxa"/>
-          </w:tblCellMar>
-        </w:tblPrEx>
         <w:tc>
           <w:tcPr>
             <w:tcW w:w="9360" w:type="dxa"/>
@@ -9920,6 +9740,24 @@
                 <w:szCs w:val="18"/>
               </w:rPr>
               <w:t xml:space="preserve"> (a guardian cannot change a signed consent — create a new form if needed). Write tests for target resolution (specific grades returns correct guardian set), duplicate response prevention, and the pending reminder job filter logic.</w:t>
+            </w:r>
+            <w:r>
+              <w:rPr>
+                <w:rFonts w:ascii="Courier New" w:eastAsia="Courier New" w:hAnsi="Courier New" w:cs="Courier New"/>
+                <w:color w:val="3A2A52"/>
+                <w:sz w:val="18"/>
+                <w:szCs w:val="18"/>
+              </w:rPr>
+              <w:br/>
+            </w:r>
+            <w:r>
+              <w:rPr>
+                <w:rFonts w:ascii="Courier New" w:eastAsia="Courier New" w:hAnsi="Courier New" w:cs="Courier New"/>
+                <w:color w:val="FF0000"/>
+                <w:sz w:val="18"/>
+                <w:szCs w:val="18"/>
+              </w:rPr>
+              <w:t>done</w:t>
             </w:r>
           </w:p>
         </w:tc>
@@ -9965,12 +9803,6 @@
         <w:gridCol w:w="2700"/>
       </w:tblGrid>
       <w:tr>
-        <w:tblPrEx>
-          <w:tblCellMar>
-            <w:top w:w="0" w:type="dxa"/>
-            <w:bottom w:w="0" w:type="dxa"/>
-          </w:tblCellMar>
-        </w:tblPrEx>
         <w:trPr>
           <w:tblHeader/>
         </w:trPr>
@@ -10096,12 +9928,6 @@
         </w:tc>
       </w:tr>
       <w:tr>
-        <w:tblPrEx>
-          <w:tblCellMar>
-            <w:top w:w="0" w:type="dxa"/>
-            <w:bottom w:w="0" w:type="dxa"/>
-          </w:tblCellMar>
-        </w:tblPrEx>
         <w:tc>
           <w:tcPr>
             <w:tcW w:w="2800" w:type="dxa"/>
@@ -10224,12 +10050,6 @@
         </w:tc>
       </w:tr>
       <w:tr>
-        <w:tblPrEx>
-          <w:tblCellMar>
-            <w:top w:w="0" w:type="dxa"/>
-            <w:bottom w:w="0" w:type="dxa"/>
-          </w:tblCellMar>
-        </w:tblPrEx>
         <w:tc>
           <w:tcPr>
             <w:tcW w:w="2800" w:type="dxa"/>
@@ -10352,12 +10172,6 @@
         </w:tc>
       </w:tr>
       <w:tr>
-        <w:tblPrEx>
-          <w:tblCellMar>
-            <w:top w:w="0" w:type="dxa"/>
-            <w:bottom w:w="0" w:type="dxa"/>
-          </w:tblCellMar>
-        </w:tblPrEx>
         <w:tc>
           <w:tcPr>
             <w:tcW w:w="2800" w:type="dxa"/>
@@ -10480,12 +10294,6 @@
         </w:tc>
       </w:tr>
       <w:tr>
-        <w:tblPrEx>
-          <w:tblCellMar>
-            <w:top w:w="0" w:type="dxa"/>
-            <w:bottom w:w="0" w:type="dxa"/>
-          </w:tblCellMar>
-        </w:tblPrEx>
         <w:tc>
           <w:tcPr>
             <w:tcW w:w="2800" w:type="dxa"/>
@@ -10657,12 +10465,6 @@
         <w:gridCol w:w="2860"/>
       </w:tblGrid>
       <w:tr>
-        <w:tblPrEx>
-          <w:tblCellMar>
-            <w:top w:w="0" w:type="dxa"/>
-            <w:bottom w:w="0" w:type="dxa"/>
-          </w:tblCellMar>
-        </w:tblPrEx>
         <w:trPr>
           <w:tblHeader/>
         </w:trPr>
@@ -10818,12 +10620,6 @@
         </w:tc>
       </w:tr>
       <w:tr>
-        <w:tblPrEx>
-          <w:tblCellMar>
-            <w:top w:w="0" w:type="dxa"/>
-            <w:bottom w:w="0" w:type="dxa"/>
-          </w:tblCellMar>
-        </w:tblPrEx>
         <w:tc>
           <w:tcPr>
             <w:tcW w:w="3000" w:type="dxa"/>
@@ -10976,12 +10772,6 @@
         </w:tc>
       </w:tr>
       <w:tr>
-        <w:tblPrEx>
-          <w:tblCellMar>
-            <w:top w:w="0" w:type="dxa"/>
-            <w:bottom w:w="0" w:type="dxa"/>
-          </w:tblCellMar>
-        </w:tblPrEx>
         <w:tc>
           <w:tcPr>
             <w:tcW w:w="3000" w:type="dxa"/>
@@ -11134,12 +10924,6 @@
         </w:tc>
       </w:tr>
       <w:tr>
-        <w:tblPrEx>
-          <w:tblCellMar>
-            <w:top w:w="0" w:type="dxa"/>
-            <w:bottom w:w="0" w:type="dxa"/>
-          </w:tblCellMar>
-        </w:tblPrEx>
         <w:tc>
           <w:tcPr>
             <w:tcW w:w="3000" w:type="dxa"/>
@@ -11292,12 +11076,6 @@
         </w:tc>
       </w:tr>
       <w:tr>
-        <w:tblPrEx>
-          <w:tblCellMar>
-            <w:top w:w="0" w:type="dxa"/>
-            <w:bottom w:w="0" w:type="dxa"/>
-          </w:tblCellMar>
-        </w:tblPrEx>
         <w:tc>
           <w:tcPr>
             <w:tcW w:w="3000" w:type="dxa"/>
@@ -11450,12 +11228,6 @@
         </w:tc>
       </w:tr>
       <w:tr>
-        <w:tblPrEx>
-          <w:tblCellMar>
-            <w:top w:w="0" w:type="dxa"/>
-            <w:bottom w:w="0" w:type="dxa"/>
-          </w:tblCellMar>
-        </w:tblPrEx>
         <w:tc>
           <w:tcPr>
             <w:tcW w:w="3000" w:type="dxa"/>
@@ -11608,12 +11380,6 @@
         </w:tc>
       </w:tr>
       <w:tr>
-        <w:tblPrEx>
-          <w:tblCellMar>
-            <w:top w:w="0" w:type="dxa"/>
-            <w:bottom w:w="0" w:type="dxa"/>
-          </w:tblCellMar>
-        </w:tblPrEx>
         <w:tc>
           <w:tcPr>
             <w:tcW w:w="3000" w:type="dxa"/>

</xml_diff>